<commit_message>
updating progress bar, ending report lines, filler phrases, additional top_urls
</commit_message>
<xml_diff>
--- a/app/assets/default_template.docx
+++ b/app/assets/default_template.docx
@@ -1,6 +1,6 @@
 
 <file path=word/document.xml><?xml version="1.0" encoding="utf-8"?>
-<w:document xmlns:wpc="http://schemas.microsoft.com/office/word/2010/wordprocessingCanvas" xmlns:cx="http://schemas.microsoft.com/office/drawing/2014/chartex" xmlns:cx1="http://schemas.microsoft.com/office/drawing/2015/9/8/chartex" xmlns:cx2="http://schemas.microsoft.com/office/drawing/2015/10/21/chartex" xmlns:cx3="http://schemas.microsoft.com/office/drawing/2016/5/9/chartex" xmlns:cx4="http://schemas.microsoft.com/office/drawing/2016/5/10/chartex" xmlns:cx5="http://schemas.microsoft.com/office/drawing/2016/5/11/chartex" xmlns:cx6="http://schemas.microsoft.com/office/drawing/2016/5/12/chartex" xmlns:cx7="http://schemas.microsoft.com/office/drawing/2016/5/13/chartex" xmlns:cx8="http://schemas.microsoft.com/office/drawing/2016/5/14/chartex" xmlns:mc="http://schemas.openxmlformats.org/markup-compatibility/2006" xmlns:aink="http://schemas.microsoft.com/office/drawing/2016/ink" xmlns:am3d="http://schemas.microsoft.com/office/drawing/2017/model3d" xmlns:o="urn:schemas-microsoft-com:office:office" xmlns:oel="http://schemas.microsoft.com/office/2019/extlst" xmlns:r="http://schemas.openxmlformats.org/officeDocument/2006/relationships" xmlns:m="http://schemas.openxmlformats.org/officeDocument/2006/math" xmlns:v="urn:schemas-microsoft-com:vml" xmlns:wp14="http://schemas.microsoft.com/office/word/2010/wordprocessingDrawing" xmlns:wp="http://schemas.openxmlformats.org/drawingml/2006/wordprocessingDrawing" xmlns:w10="urn:schemas-microsoft-com:office:word" xmlns:w="http://schemas.openxmlformats.org/wordprocessingml/2006/main" xmlns:w14="http://schemas.microsoft.com/office/word/2010/wordml" xmlns:w15="http://schemas.microsoft.com/office/word/2012/wordml" xmlns:w16cei="http://schemas.microsoft.com/office/word/2026/wordml/cei" xmlns:w16cex="http://schemas.microsoft.com/office/word/2018/wordml/cex" xmlns:w16cid="http://schemas.microsoft.com/office/word/2016/wordml/cid" xmlns:w16="http://schemas.microsoft.com/office/word/2018/wordml" xmlns:w16du="http://schemas.microsoft.com/office/word/2023/wordml/word16du" xmlns:w16sdtdh="http://schemas.microsoft.com/office/word/2020/wordml/sdtdatahash" xmlns:w16sdtfl="http://schemas.microsoft.com/office/word/2024/wordml/sdtformatlock" xmlns:w16se="http://schemas.microsoft.com/office/word/2015/wordml/symex" xmlns:wpg="http://schemas.microsoft.com/office/word/2010/wordprocessingGroup" xmlns:wpi="http://schemas.microsoft.com/office/word/2010/wordprocessingInk" xmlns:wne="http://schemas.microsoft.com/office/word/2006/wordml" xmlns:wps="http://schemas.microsoft.com/office/word/2010/wordprocessingShape" mc:Ignorable="w14 w15 w16se w16cid w16 w16cex w16sdtdh w16sdtfl w16du wp14">
+<w:document xmlns:wpc="http://schemas.microsoft.com/office/word/2010/wordprocessingCanvas" xmlns:cx="http://schemas.microsoft.com/office/drawing/2014/chartex" xmlns:cx1="http://schemas.microsoft.com/office/drawing/2015/9/8/chartex" xmlns:cx2="http://schemas.microsoft.com/office/drawing/2015/10/21/chartex" xmlns:cx3="http://schemas.microsoft.com/office/drawing/2016/5/9/chartex" xmlns:cx4="http://schemas.microsoft.com/office/drawing/2016/5/10/chartex" xmlns:cx5="http://schemas.microsoft.com/office/drawing/2016/5/11/chartex" xmlns:cx6="http://schemas.microsoft.com/office/drawing/2016/5/12/chartex" xmlns:cx7="http://schemas.microsoft.com/office/drawing/2016/5/13/chartex" xmlns:cx8="http://schemas.microsoft.com/office/drawing/2016/5/14/chartex" xmlns:mc="http://schemas.openxmlformats.org/markup-compatibility/2006" xmlns:aink="http://schemas.microsoft.com/office/drawing/2016/ink" xmlns:am3d="http://schemas.microsoft.com/office/drawing/2017/model3d" xmlns:o="urn:schemas-microsoft-com:office:office" xmlns:oel="http://schemas.microsoft.com/office/2019/extlst" xmlns:r="http://schemas.openxmlformats.org/officeDocument/2006/relationships" xmlns:m="http://schemas.openxmlformats.org/officeDocument/2006/math" xmlns:v="urn:schemas-microsoft-com:vml" xmlns:wp14="http://schemas.microsoft.com/office/word/2010/wordprocessingDrawing" xmlns:wp="http://schemas.openxmlformats.org/drawingml/2006/wordprocessingDrawing" xmlns:w10="urn:schemas-microsoft-com:office:word" xmlns:w="http://schemas.openxmlformats.org/wordprocessingml/2006/main" xmlns:w14="http://schemas.microsoft.com/office/word/2010/wordml" xmlns:w15="http://schemas.microsoft.com/office/word/2012/wordml" xmlns:w16cex="http://schemas.microsoft.com/office/word/2018/wordml/cex" xmlns:w16cid="http://schemas.microsoft.com/office/word/2016/wordml/cid" xmlns:w16="http://schemas.microsoft.com/office/word/2018/wordml" xmlns:w16du="http://schemas.microsoft.com/office/word/2023/wordml/word16du" xmlns:w16sdtdh="http://schemas.microsoft.com/office/word/2020/wordml/sdtdatahash" xmlns:w16sdtfl="http://schemas.microsoft.com/office/word/2024/wordml/sdtformatlock" xmlns:w16se="http://schemas.microsoft.com/office/word/2015/wordml/symex" xmlns:wpg="http://schemas.microsoft.com/office/word/2010/wordprocessingGroup" xmlns:wpi="http://schemas.microsoft.com/office/word/2010/wordprocessingInk" xmlns:wne="http://schemas.microsoft.com/office/word/2006/wordml" xmlns:wps="http://schemas.microsoft.com/office/word/2010/wordprocessingShape" mc:Ignorable="w14 w15 w16se w16cid w16 w16cex w16sdtdh w16sdtfl w16du wp14">
   <w:body>
     <w:p>
       <w:pPr>
@@ -98,7 +98,7 @@
               </wp:anchor>
             </w:drawing>
           </mc:Choice>
-          <mc:Fallback>
+          <mc:Fallback xmlns:w16cei="http://schemas.microsoft.com/office/word/2026/wordml/cei">
             <w:pict>
               <v:group w14:anchorId="08AC1105" id="Group 11" o:spid="_x0000_s1026" style="position:absolute;margin-left:-18pt;margin-top:10.95pt;width:450pt;height:3.9pt;z-index:251659264" coordorigin="9906,7302" coordsize="68580,1080" o:gfxdata="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">
                 <v:line id="Straight Connector 8" o:spid="_x0000_s1027" style="position:absolute;visibility:visible;mso-wrap-style:square" from="9906,7302" to="78486,7302" o:connectortype="straight" o:gfxdata="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" strokecolor="#ffc000" strokeweight="6pt"/>
@@ -977,118 +977,6 @@
           <w:lang w:bidi="en-US"/>
         </w:rPr>
         <w:t>{% endfor %}</w:t>
-      </w:r>
-    </w:p>
-    <w:p>
-      <w:pPr>
-        <w:jc w:val="center"/>
-        <w:rPr>
-          <w:rFonts w:ascii="Arial" w:hAnsi="Arial" w:cs="Arial"/>
-          <w:b/>
-          <w:color w:val="000000"/>
-          <w:sz w:val="20"/>
-          <w:szCs w:val="20"/>
-          <w:u w:val="single"/>
-          <w:lang w:bidi="en-US"/>
-        </w:rPr>
-      </w:pPr>
-    </w:p>
-    <w:p>
-      <w:pPr>
-        <w:jc w:val="center"/>
-        <w:rPr>
-          <w:rFonts w:ascii="Arial" w:hAnsi="Arial" w:cs="Arial"/>
-          <w:b/>
-          <w:color w:val="000000"/>
-          <w:sz w:val="20"/>
-          <w:szCs w:val="20"/>
-          <w:u w:val="single"/>
-          <w:lang w:bidi="en-US"/>
-        </w:rPr>
-      </w:pPr>
-    </w:p>
-    <w:p>
-      <w:pPr>
-        <w:jc w:val="center"/>
-        <w:rPr>
-          <w:rFonts w:ascii="Arial" w:hAnsi="Arial" w:cs="Arial"/>
-          <w:color w:val="000000"/>
-          <w:sz w:val="20"/>
-          <w:szCs w:val="20"/>
-          <w:lang w:bidi="en-US"/>
-        </w:rPr>
-      </w:pPr>
-      <w:r>
-        <w:rPr>
-          <w:rFonts w:ascii="Arial" w:hAnsi="Arial" w:cs="Arial"/>
-          <w:color w:val="000000"/>
-          <w:sz w:val="20"/>
-          <w:szCs w:val="20"/>
-          <w:lang w:bidi="en-US"/>
-        </w:rPr>
-        <w:t>----</w:t>
-      </w:r>
-    </w:p>
-    <w:p>
-      <w:pPr>
-        <w:pBdr>
-          <w:top w:val="single" w:sz="4" w:space="1" w:color="auto"/>
-        </w:pBdr>
-        <w:jc w:val="center"/>
-        <w:rPr>
-          <w:rFonts w:ascii="Arial" w:hAnsi="Arial" w:cs="Arial"/>
-          <w:color w:val="000000"/>
-          <w:sz w:val="20"/>
-          <w:szCs w:val="20"/>
-          <w:lang w:bidi="en-US"/>
-        </w:rPr>
-      </w:pPr>
-      <w:r>
-        <w:rPr>
-          <w:rFonts w:ascii="Arial" w:hAnsi="Arial" w:cs="Arial"/>
-          <w:color w:val="000000"/>
-          <w:sz w:val="20"/>
-          <w:szCs w:val="20"/>
-          <w:lang w:bidi="en-US"/>
-        </w:rPr>
-        <w:t>----</w:t>
-      </w:r>
-    </w:p>
-    <w:p>
-      <w:pPr>
-        <w:pBdr>
-          <w:top w:val="single" w:sz="4" w:space="1" w:color="auto"/>
-        </w:pBdr>
-        <w:jc w:val="center"/>
-        <w:rPr>
-          <w:rFonts w:ascii="Arial" w:hAnsi="Arial" w:cs="Arial"/>
-          <w:color w:val="000000"/>
-          <w:sz w:val="20"/>
-          <w:szCs w:val="20"/>
-          <w:lang w:bidi="en-US"/>
-        </w:rPr>
-      </w:pPr>
-    </w:p>
-    <w:p>
-      <w:pPr>
-        <w:rPr>
-          <w:rFonts w:ascii="Arial" w:eastAsia="Calibri" w:hAnsi="Arial" w:cs="Arial"/>
-          <w:color w:val="000000"/>
-          <w:sz w:val="21"/>
-          <w:szCs w:val="21"/>
-          <w:lang w:bidi="en-US"/>
-        </w:rPr>
-      </w:pPr>
-      <w:r>
-        <w:rPr>
-          <w:rFonts w:ascii="Arial" w:eastAsia="Calibri" w:hAnsi="Arial" w:cs="Arial"/>
-          <w:b/>
-          <w:color w:val="000000"/>
-          <w:sz w:val="20"/>
-          <w:szCs w:val="20"/>
-          <w:lang w:bidi="en-US"/>
-        </w:rPr>
-        <w:t>---</w:t>
       </w:r>
     </w:p>
     <w:p>
@@ -1146,7 +1034,7 @@
 </file>
 
 <file path=word/endnotes.xml><?xml version="1.0" encoding="utf-8"?>
-<w:endnotes xmlns:wpc="http://schemas.microsoft.com/office/word/2010/wordprocessingCanvas" xmlns:cx="http://schemas.microsoft.com/office/drawing/2014/chartex" xmlns:cx1="http://schemas.microsoft.com/office/drawing/2015/9/8/chartex" xmlns:cx2="http://schemas.microsoft.com/office/drawing/2015/10/21/chartex" xmlns:cx3="http://schemas.microsoft.com/office/drawing/2016/5/9/chartex" xmlns:cx4="http://schemas.microsoft.com/office/drawing/2016/5/10/chartex" xmlns:cx5="http://schemas.microsoft.com/office/drawing/2016/5/11/chartex" xmlns:cx6="http://schemas.microsoft.com/office/drawing/2016/5/12/chartex" xmlns:cx7="http://schemas.microsoft.com/office/drawing/2016/5/13/chartex" xmlns:cx8="http://schemas.microsoft.com/office/drawing/2016/5/14/chartex" xmlns:mc="http://schemas.openxmlformats.org/markup-compatibility/2006" xmlns:aink="http://schemas.microsoft.com/office/drawing/2016/ink" xmlns:am3d="http://schemas.microsoft.com/office/drawing/2017/model3d" xmlns:o="urn:schemas-microsoft-com:office:office" xmlns:oel="http://schemas.microsoft.com/office/2019/extlst" xmlns:r="http://schemas.openxmlformats.org/officeDocument/2006/relationships" xmlns:m="http://schemas.openxmlformats.org/officeDocument/2006/math" xmlns:v="urn:schemas-microsoft-com:vml" xmlns:wp14="http://schemas.microsoft.com/office/word/2010/wordprocessingDrawing" xmlns:wp="http://schemas.openxmlformats.org/drawingml/2006/wordprocessingDrawing" xmlns:w10="urn:schemas-microsoft-com:office:word" xmlns:w="http://schemas.openxmlformats.org/wordprocessingml/2006/main" xmlns:w14="http://schemas.microsoft.com/office/word/2010/wordml" xmlns:w15="http://schemas.microsoft.com/office/word/2012/wordml" xmlns:w16cei="http://schemas.microsoft.com/office/word/2026/wordml/cei" xmlns:w16cex="http://schemas.microsoft.com/office/word/2018/wordml/cex" xmlns:w16cid="http://schemas.microsoft.com/office/word/2016/wordml/cid" xmlns:w16="http://schemas.microsoft.com/office/word/2018/wordml" xmlns:w16du="http://schemas.microsoft.com/office/word/2023/wordml/word16du" xmlns:w16sdtdh="http://schemas.microsoft.com/office/word/2020/wordml/sdtdatahash" xmlns:w16sdtfl="http://schemas.microsoft.com/office/word/2024/wordml/sdtformatlock" xmlns:w16se="http://schemas.microsoft.com/office/word/2015/wordml/symex" xmlns:wpg="http://schemas.microsoft.com/office/word/2010/wordprocessingGroup" xmlns:wpi="http://schemas.microsoft.com/office/word/2010/wordprocessingInk" xmlns:wne="http://schemas.microsoft.com/office/word/2006/wordml" xmlns:wps="http://schemas.microsoft.com/office/word/2010/wordprocessingShape" mc:Ignorable="w14 w15 w16se w16cid w16 w16cex w16sdtdh w16sdtfl w16du wp14">
+<w:endnotes xmlns:wpc="http://schemas.microsoft.com/office/word/2010/wordprocessingCanvas" xmlns:cx="http://schemas.microsoft.com/office/drawing/2014/chartex" xmlns:cx1="http://schemas.microsoft.com/office/drawing/2015/9/8/chartex" xmlns:cx2="http://schemas.microsoft.com/office/drawing/2015/10/21/chartex" xmlns:cx3="http://schemas.microsoft.com/office/drawing/2016/5/9/chartex" xmlns:cx4="http://schemas.microsoft.com/office/drawing/2016/5/10/chartex" xmlns:cx5="http://schemas.microsoft.com/office/drawing/2016/5/11/chartex" xmlns:cx6="http://schemas.microsoft.com/office/drawing/2016/5/12/chartex" xmlns:cx7="http://schemas.microsoft.com/office/drawing/2016/5/13/chartex" xmlns:cx8="http://schemas.microsoft.com/office/drawing/2016/5/14/chartex" xmlns:mc="http://schemas.openxmlformats.org/markup-compatibility/2006" xmlns:aink="http://schemas.microsoft.com/office/drawing/2016/ink" xmlns:am3d="http://schemas.microsoft.com/office/drawing/2017/model3d" xmlns:o="urn:schemas-microsoft-com:office:office" xmlns:oel="http://schemas.microsoft.com/office/2019/extlst" xmlns:r="http://schemas.openxmlformats.org/officeDocument/2006/relationships" xmlns:m="http://schemas.openxmlformats.org/officeDocument/2006/math" xmlns:v="urn:schemas-microsoft-com:vml" xmlns:wp14="http://schemas.microsoft.com/office/word/2010/wordprocessingDrawing" xmlns:wp="http://schemas.openxmlformats.org/drawingml/2006/wordprocessingDrawing" xmlns:w10="urn:schemas-microsoft-com:office:word" xmlns:w="http://schemas.openxmlformats.org/wordprocessingml/2006/main" xmlns:w14="http://schemas.microsoft.com/office/word/2010/wordml" xmlns:w15="http://schemas.microsoft.com/office/word/2012/wordml" xmlns:w16cex="http://schemas.microsoft.com/office/word/2018/wordml/cex" xmlns:w16cid="http://schemas.microsoft.com/office/word/2016/wordml/cid" xmlns:w16="http://schemas.microsoft.com/office/word/2018/wordml" xmlns:w16du="http://schemas.microsoft.com/office/word/2023/wordml/word16du" xmlns:w16sdtdh="http://schemas.microsoft.com/office/word/2020/wordml/sdtdatahash" xmlns:w16sdtfl="http://schemas.microsoft.com/office/word/2024/wordml/sdtformatlock" xmlns:w16se="http://schemas.microsoft.com/office/word/2015/wordml/symex" xmlns:wpg="http://schemas.microsoft.com/office/word/2010/wordprocessingGroup" xmlns:wpi="http://schemas.microsoft.com/office/word/2010/wordprocessingInk" xmlns:wne="http://schemas.microsoft.com/office/word/2006/wordml" xmlns:wps="http://schemas.microsoft.com/office/word/2010/wordprocessingShape" mc:Ignorable="w14 w15 w16se w16cid w16 w16cex w16sdtdh w16sdtfl w16du wp14">
   <w:endnote w:type="separator" w:id="-1">
     <w:p>
       <w:r>
@@ -1165,7 +1053,7 @@
 </file>
 
 <file path=word/footer1.xml><?xml version="1.0" encoding="utf-8"?>
-<w:ftr xmlns:wpc="http://schemas.microsoft.com/office/word/2010/wordprocessingCanvas" xmlns:cx="http://schemas.microsoft.com/office/drawing/2014/chartex" xmlns:cx1="http://schemas.microsoft.com/office/drawing/2015/9/8/chartex" xmlns:cx2="http://schemas.microsoft.com/office/drawing/2015/10/21/chartex" xmlns:cx3="http://schemas.microsoft.com/office/drawing/2016/5/9/chartex" xmlns:cx4="http://schemas.microsoft.com/office/drawing/2016/5/10/chartex" xmlns:cx5="http://schemas.microsoft.com/office/drawing/2016/5/11/chartex" xmlns:cx6="http://schemas.microsoft.com/office/drawing/2016/5/12/chartex" xmlns:cx7="http://schemas.microsoft.com/office/drawing/2016/5/13/chartex" xmlns:cx8="http://schemas.microsoft.com/office/drawing/2016/5/14/chartex" xmlns:mc="http://schemas.openxmlformats.org/markup-compatibility/2006" xmlns:aink="http://schemas.microsoft.com/office/drawing/2016/ink" xmlns:am3d="http://schemas.microsoft.com/office/drawing/2017/model3d" xmlns:o="urn:schemas-microsoft-com:office:office" xmlns:oel="http://schemas.microsoft.com/office/2019/extlst" xmlns:r="http://schemas.openxmlformats.org/officeDocument/2006/relationships" xmlns:m="http://schemas.openxmlformats.org/officeDocument/2006/math" xmlns:v="urn:schemas-microsoft-com:vml" xmlns:wp14="http://schemas.microsoft.com/office/word/2010/wordprocessingDrawing" xmlns:wp="http://schemas.openxmlformats.org/drawingml/2006/wordprocessingDrawing" xmlns:w10="urn:schemas-microsoft-com:office:word" xmlns:w="http://schemas.openxmlformats.org/wordprocessingml/2006/main" xmlns:w14="http://schemas.microsoft.com/office/word/2010/wordml" xmlns:w15="http://schemas.microsoft.com/office/word/2012/wordml" xmlns:w16cei="http://schemas.microsoft.com/office/word/2026/wordml/cei" xmlns:w16cex="http://schemas.microsoft.com/office/word/2018/wordml/cex" xmlns:w16cid="http://schemas.microsoft.com/office/word/2016/wordml/cid" xmlns:w16="http://schemas.microsoft.com/office/word/2018/wordml" xmlns:w16du="http://schemas.microsoft.com/office/word/2023/wordml/word16du" xmlns:w16sdtdh="http://schemas.microsoft.com/office/word/2020/wordml/sdtdatahash" xmlns:w16sdtfl="http://schemas.microsoft.com/office/word/2024/wordml/sdtformatlock" xmlns:w16se="http://schemas.microsoft.com/office/word/2015/wordml/symex" xmlns:wpg="http://schemas.microsoft.com/office/word/2010/wordprocessingGroup" xmlns:wpi="http://schemas.microsoft.com/office/word/2010/wordprocessingInk" xmlns:wne="http://schemas.microsoft.com/office/word/2006/wordml" xmlns:wps="http://schemas.microsoft.com/office/word/2010/wordprocessingShape" mc:Ignorable="w14 w15 w16se w16cid w16 w16cex w16sdtdh w16sdtfl w16du wp14">
+<w:ftr xmlns:wpc="http://schemas.microsoft.com/office/word/2010/wordprocessingCanvas" xmlns:cx="http://schemas.microsoft.com/office/drawing/2014/chartex" xmlns:cx1="http://schemas.microsoft.com/office/drawing/2015/9/8/chartex" xmlns:cx2="http://schemas.microsoft.com/office/drawing/2015/10/21/chartex" xmlns:cx3="http://schemas.microsoft.com/office/drawing/2016/5/9/chartex" xmlns:cx4="http://schemas.microsoft.com/office/drawing/2016/5/10/chartex" xmlns:cx5="http://schemas.microsoft.com/office/drawing/2016/5/11/chartex" xmlns:cx6="http://schemas.microsoft.com/office/drawing/2016/5/12/chartex" xmlns:cx7="http://schemas.microsoft.com/office/drawing/2016/5/13/chartex" xmlns:cx8="http://schemas.microsoft.com/office/drawing/2016/5/14/chartex" xmlns:mc="http://schemas.openxmlformats.org/markup-compatibility/2006" xmlns:aink="http://schemas.microsoft.com/office/drawing/2016/ink" xmlns:am3d="http://schemas.microsoft.com/office/drawing/2017/model3d" xmlns:o="urn:schemas-microsoft-com:office:office" xmlns:oel="http://schemas.microsoft.com/office/2019/extlst" xmlns:r="http://schemas.openxmlformats.org/officeDocument/2006/relationships" xmlns:m="http://schemas.openxmlformats.org/officeDocument/2006/math" xmlns:v="urn:schemas-microsoft-com:vml" xmlns:wp14="http://schemas.microsoft.com/office/word/2010/wordprocessingDrawing" xmlns:wp="http://schemas.openxmlformats.org/drawingml/2006/wordprocessingDrawing" xmlns:w10="urn:schemas-microsoft-com:office:word" xmlns:w="http://schemas.openxmlformats.org/wordprocessingml/2006/main" xmlns:w14="http://schemas.microsoft.com/office/word/2010/wordml" xmlns:w15="http://schemas.microsoft.com/office/word/2012/wordml" xmlns:w16cex="http://schemas.microsoft.com/office/word/2018/wordml/cex" xmlns:w16cid="http://schemas.microsoft.com/office/word/2016/wordml/cid" xmlns:w16="http://schemas.microsoft.com/office/word/2018/wordml" xmlns:w16du="http://schemas.microsoft.com/office/word/2023/wordml/word16du" xmlns:w16sdtdh="http://schemas.microsoft.com/office/word/2020/wordml/sdtdatahash" xmlns:w16sdtfl="http://schemas.microsoft.com/office/word/2024/wordml/sdtformatlock" xmlns:w16se="http://schemas.microsoft.com/office/word/2015/wordml/symex" xmlns:wpg="http://schemas.microsoft.com/office/word/2010/wordprocessingGroup" xmlns:wpi="http://schemas.microsoft.com/office/word/2010/wordprocessingInk" xmlns:wne="http://schemas.microsoft.com/office/word/2006/wordml" xmlns:wps="http://schemas.microsoft.com/office/word/2010/wordprocessingShape" mc:Ignorable="w14 w15 w16se w16cid w16 w16cex w16sdtdh w16sdtfl w16du wp14">
   <w:p>
     <w:pPr>
       <w:pStyle w:val="Footer"/>
@@ -1176,7 +1064,7 @@
 </file>
 
 <file path=word/footer2.xml><?xml version="1.0" encoding="utf-8"?>
-<w:ftr xmlns:wpc="http://schemas.microsoft.com/office/word/2010/wordprocessingCanvas" xmlns:cx="http://schemas.microsoft.com/office/drawing/2014/chartex" xmlns:cx1="http://schemas.microsoft.com/office/drawing/2015/9/8/chartex" xmlns:cx2="http://schemas.microsoft.com/office/drawing/2015/10/21/chartex" xmlns:cx3="http://schemas.microsoft.com/office/drawing/2016/5/9/chartex" xmlns:cx4="http://schemas.microsoft.com/office/drawing/2016/5/10/chartex" xmlns:cx5="http://schemas.microsoft.com/office/drawing/2016/5/11/chartex" xmlns:cx6="http://schemas.microsoft.com/office/drawing/2016/5/12/chartex" xmlns:cx7="http://schemas.microsoft.com/office/drawing/2016/5/13/chartex" xmlns:cx8="http://schemas.microsoft.com/office/drawing/2016/5/14/chartex" xmlns:mc="http://schemas.openxmlformats.org/markup-compatibility/2006" xmlns:aink="http://schemas.microsoft.com/office/drawing/2016/ink" xmlns:am3d="http://schemas.microsoft.com/office/drawing/2017/model3d" xmlns:o="urn:schemas-microsoft-com:office:office" xmlns:oel="http://schemas.microsoft.com/office/2019/extlst" xmlns:r="http://schemas.openxmlformats.org/officeDocument/2006/relationships" xmlns:m="http://schemas.openxmlformats.org/officeDocument/2006/math" xmlns:v="urn:schemas-microsoft-com:vml" xmlns:wp14="http://schemas.microsoft.com/office/word/2010/wordprocessingDrawing" xmlns:wp="http://schemas.openxmlformats.org/drawingml/2006/wordprocessingDrawing" xmlns:w10="urn:schemas-microsoft-com:office:word" xmlns:w="http://schemas.openxmlformats.org/wordprocessingml/2006/main" xmlns:w14="http://schemas.microsoft.com/office/word/2010/wordml" xmlns:w15="http://schemas.microsoft.com/office/word/2012/wordml" xmlns:w16cei="http://schemas.microsoft.com/office/word/2026/wordml/cei" xmlns:w16cex="http://schemas.microsoft.com/office/word/2018/wordml/cex" xmlns:w16cid="http://schemas.microsoft.com/office/word/2016/wordml/cid" xmlns:w16="http://schemas.microsoft.com/office/word/2018/wordml" xmlns:w16du="http://schemas.microsoft.com/office/word/2023/wordml/word16du" xmlns:w16sdtdh="http://schemas.microsoft.com/office/word/2020/wordml/sdtdatahash" xmlns:w16sdtfl="http://schemas.microsoft.com/office/word/2024/wordml/sdtformatlock" xmlns:w16se="http://schemas.microsoft.com/office/word/2015/wordml/symex" xmlns:wpg="http://schemas.microsoft.com/office/word/2010/wordprocessingGroup" xmlns:wpi="http://schemas.microsoft.com/office/word/2010/wordprocessingInk" xmlns:wne="http://schemas.microsoft.com/office/word/2006/wordml" xmlns:wps="http://schemas.microsoft.com/office/word/2010/wordprocessingShape" mc:Ignorable="w14 w15 w16se w16cid w16 w16cex w16sdtdh w16sdtfl w16du wp14">
+<w:ftr xmlns:wpc="http://schemas.microsoft.com/office/word/2010/wordprocessingCanvas" xmlns:cx="http://schemas.microsoft.com/office/drawing/2014/chartex" xmlns:cx1="http://schemas.microsoft.com/office/drawing/2015/9/8/chartex" xmlns:cx2="http://schemas.microsoft.com/office/drawing/2015/10/21/chartex" xmlns:cx3="http://schemas.microsoft.com/office/drawing/2016/5/9/chartex" xmlns:cx4="http://schemas.microsoft.com/office/drawing/2016/5/10/chartex" xmlns:cx5="http://schemas.microsoft.com/office/drawing/2016/5/11/chartex" xmlns:cx6="http://schemas.microsoft.com/office/drawing/2016/5/12/chartex" xmlns:cx7="http://schemas.microsoft.com/office/drawing/2016/5/13/chartex" xmlns:cx8="http://schemas.microsoft.com/office/drawing/2016/5/14/chartex" xmlns:mc="http://schemas.openxmlformats.org/markup-compatibility/2006" xmlns:aink="http://schemas.microsoft.com/office/drawing/2016/ink" xmlns:am3d="http://schemas.microsoft.com/office/drawing/2017/model3d" xmlns:o="urn:schemas-microsoft-com:office:office" xmlns:oel="http://schemas.microsoft.com/office/2019/extlst" xmlns:r="http://schemas.openxmlformats.org/officeDocument/2006/relationships" xmlns:m="http://schemas.openxmlformats.org/officeDocument/2006/math" xmlns:v="urn:schemas-microsoft-com:vml" xmlns:wp14="http://schemas.microsoft.com/office/word/2010/wordprocessingDrawing" xmlns:wp="http://schemas.openxmlformats.org/drawingml/2006/wordprocessingDrawing" xmlns:w10="urn:schemas-microsoft-com:office:word" xmlns:w="http://schemas.openxmlformats.org/wordprocessingml/2006/main" xmlns:w14="http://schemas.microsoft.com/office/word/2010/wordml" xmlns:w15="http://schemas.microsoft.com/office/word/2012/wordml" xmlns:w16cex="http://schemas.microsoft.com/office/word/2018/wordml/cex" xmlns:w16cid="http://schemas.microsoft.com/office/word/2016/wordml/cid" xmlns:w16="http://schemas.microsoft.com/office/word/2018/wordml" xmlns:w16du="http://schemas.microsoft.com/office/word/2023/wordml/word16du" xmlns:w16sdtdh="http://schemas.microsoft.com/office/word/2020/wordml/sdtdatahash" xmlns:w16sdtfl="http://schemas.microsoft.com/office/word/2024/wordml/sdtformatlock" xmlns:w16se="http://schemas.microsoft.com/office/word/2015/wordml/symex" xmlns:wpg="http://schemas.microsoft.com/office/word/2010/wordprocessingGroup" xmlns:wpi="http://schemas.microsoft.com/office/word/2010/wordprocessingInk" xmlns:wne="http://schemas.microsoft.com/office/word/2006/wordml" xmlns:wps="http://schemas.microsoft.com/office/word/2010/wordprocessingShape" mc:Ignorable="w14 w15 w16se w16cid w16 w16cex w16sdtdh w16sdtfl w16du wp14">
   <w:p>
     <w:pPr>
       <w:tabs>
@@ -1195,7 +1083,7 @@
 </file>
 
 <file path=word/footnotes.xml><?xml version="1.0" encoding="utf-8"?>
-<w:footnotes xmlns:wpc="http://schemas.microsoft.com/office/word/2010/wordprocessingCanvas" xmlns:cx="http://schemas.microsoft.com/office/drawing/2014/chartex" xmlns:cx1="http://schemas.microsoft.com/office/drawing/2015/9/8/chartex" xmlns:cx2="http://schemas.microsoft.com/office/drawing/2015/10/21/chartex" xmlns:cx3="http://schemas.microsoft.com/office/drawing/2016/5/9/chartex" xmlns:cx4="http://schemas.microsoft.com/office/drawing/2016/5/10/chartex" xmlns:cx5="http://schemas.microsoft.com/office/drawing/2016/5/11/chartex" xmlns:cx6="http://schemas.microsoft.com/office/drawing/2016/5/12/chartex" xmlns:cx7="http://schemas.microsoft.com/office/drawing/2016/5/13/chartex" xmlns:cx8="http://schemas.microsoft.com/office/drawing/2016/5/14/chartex" xmlns:mc="http://schemas.openxmlformats.org/markup-compatibility/2006" xmlns:aink="http://schemas.microsoft.com/office/drawing/2016/ink" xmlns:am3d="http://schemas.microsoft.com/office/drawing/2017/model3d" xmlns:o="urn:schemas-microsoft-com:office:office" xmlns:oel="http://schemas.microsoft.com/office/2019/extlst" xmlns:r="http://schemas.openxmlformats.org/officeDocument/2006/relationships" xmlns:m="http://schemas.openxmlformats.org/officeDocument/2006/math" xmlns:v="urn:schemas-microsoft-com:vml" xmlns:wp14="http://schemas.microsoft.com/office/word/2010/wordprocessingDrawing" xmlns:wp="http://schemas.openxmlformats.org/drawingml/2006/wordprocessingDrawing" xmlns:w10="urn:schemas-microsoft-com:office:word" xmlns:w="http://schemas.openxmlformats.org/wordprocessingml/2006/main" xmlns:w14="http://schemas.microsoft.com/office/word/2010/wordml" xmlns:w15="http://schemas.microsoft.com/office/word/2012/wordml" xmlns:w16cei="http://schemas.microsoft.com/office/word/2026/wordml/cei" xmlns:w16cex="http://schemas.microsoft.com/office/word/2018/wordml/cex" xmlns:w16cid="http://schemas.microsoft.com/office/word/2016/wordml/cid" xmlns:w16="http://schemas.microsoft.com/office/word/2018/wordml" xmlns:w16du="http://schemas.microsoft.com/office/word/2023/wordml/word16du" xmlns:w16sdtdh="http://schemas.microsoft.com/office/word/2020/wordml/sdtdatahash" xmlns:w16sdtfl="http://schemas.microsoft.com/office/word/2024/wordml/sdtformatlock" xmlns:w16se="http://schemas.microsoft.com/office/word/2015/wordml/symex" xmlns:wpg="http://schemas.microsoft.com/office/word/2010/wordprocessingGroup" xmlns:wpi="http://schemas.microsoft.com/office/word/2010/wordprocessingInk" xmlns:wne="http://schemas.microsoft.com/office/word/2006/wordml" xmlns:wps="http://schemas.microsoft.com/office/word/2010/wordprocessingShape" mc:Ignorable="w14 w15 w16se w16cid w16 w16cex w16sdtdh w16sdtfl w16du wp14">
+<w:footnotes xmlns:wpc="http://schemas.microsoft.com/office/word/2010/wordprocessingCanvas" xmlns:cx="http://schemas.microsoft.com/office/drawing/2014/chartex" xmlns:cx1="http://schemas.microsoft.com/office/drawing/2015/9/8/chartex" xmlns:cx2="http://schemas.microsoft.com/office/drawing/2015/10/21/chartex" xmlns:cx3="http://schemas.microsoft.com/office/drawing/2016/5/9/chartex" xmlns:cx4="http://schemas.microsoft.com/office/drawing/2016/5/10/chartex" xmlns:cx5="http://schemas.microsoft.com/office/drawing/2016/5/11/chartex" xmlns:cx6="http://schemas.microsoft.com/office/drawing/2016/5/12/chartex" xmlns:cx7="http://schemas.microsoft.com/office/drawing/2016/5/13/chartex" xmlns:cx8="http://schemas.microsoft.com/office/drawing/2016/5/14/chartex" xmlns:mc="http://schemas.openxmlformats.org/markup-compatibility/2006" xmlns:aink="http://schemas.microsoft.com/office/drawing/2016/ink" xmlns:am3d="http://schemas.microsoft.com/office/drawing/2017/model3d" xmlns:o="urn:schemas-microsoft-com:office:office" xmlns:oel="http://schemas.microsoft.com/office/2019/extlst" xmlns:r="http://schemas.openxmlformats.org/officeDocument/2006/relationships" xmlns:m="http://schemas.openxmlformats.org/officeDocument/2006/math" xmlns:v="urn:schemas-microsoft-com:vml" xmlns:wp14="http://schemas.microsoft.com/office/word/2010/wordprocessingDrawing" xmlns:wp="http://schemas.openxmlformats.org/drawingml/2006/wordprocessingDrawing" xmlns:w10="urn:schemas-microsoft-com:office:word" xmlns:w="http://schemas.openxmlformats.org/wordprocessingml/2006/main" xmlns:w14="http://schemas.microsoft.com/office/word/2010/wordml" xmlns:w15="http://schemas.microsoft.com/office/word/2012/wordml" xmlns:w16cex="http://schemas.microsoft.com/office/word/2018/wordml/cex" xmlns:w16cid="http://schemas.microsoft.com/office/word/2016/wordml/cid" xmlns:w16="http://schemas.microsoft.com/office/word/2018/wordml" xmlns:w16du="http://schemas.microsoft.com/office/word/2023/wordml/word16du" xmlns:w16sdtdh="http://schemas.microsoft.com/office/word/2020/wordml/sdtdatahash" xmlns:w16sdtfl="http://schemas.microsoft.com/office/word/2024/wordml/sdtformatlock" xmlns:w16se="http://schemas.microsoft.com/office/word/2015/wordml/symex" xmlns:wpg="http://schemas.microsoft.com/office/word/2010/wordprocessingGroup" xmlns:wpi="http://schemas.microsoft.com/office/word/2010/wordprocessingInk" xmlns:wne="http://schemas.microsoft.com/office/word/2006/wordml" xmlns:wps="http://schemas.microsoft.com/office/word/2010/wordprocessingShape" mc:Ignorable="w14 w15 w16se w16cid w16 w16cex w16sdtdh w16sdtfl w16du wp14">
   <w:footnote w:type="separator" w:id="-1">
     <w:p>
       <w:r>
@@ -1214,7 +1102,7 @@
 </file>
 
 <file path=word/header1.xml><?xml version="1.0" encoding="utf-8"?>
-<w:hdr xmlns:wpc="http://schemas.microsoft.com/office/word/2010/wordprocessingCanvas" xmlns:cx="http://schemas.microsoft.com/office/drawing/2014/chartex" xmlns:cx1="http://schemas.microsoft.com/office/drawing/2015/9/8/chartex" xmlns:cx2="http://schemas.microsoft.com/office/drawing/2015/10/21/chartex" xmlns:cx3="http://schemas.microsoft.com/office/drawing/2016/5/9/chartex" xmlns:cx4="http://schemas.microsoft.com/office/drawing/2016/5/10/chartex" xmlns:cx5="http://schemas.microsoft.com/office/drawing/2016/5/11/chartex" xmlns:cx6="http://schemas.microsoft.com/office/drawing/2016/5/12/chartex" xmlns:cx7="http://schemas.microsoft.com/office/drawing/2016/5/13/chartex" xmlns:cx8="http://schemas.microsoft.com/office/drawing/2016/5/14/chartex" xmlns:mc="http://schemas.openxmlformats.org/markup-compatibility/2006" xmlns:aink="http://schemas.microsoft.com/office/drawing/2016/ink" xmlns:am3d="http://schemas.microsoft.com/office/drawing/2017/model3d" xmlns:o="urn:schemas-microsoft-com:office:office" xmlns:oel="http://schemas.microsoft.com/office/2019/extlst" xmlns:r="http://schemas.openxmlformats.org/officeDocument/2006/relationships" xmlns:m="http://schemas.openxmlformats.org/officeDocument/2006/math" xmlns:v="urn:schemas-microsoft-com:vml" xmlns:wp14="http://schemas.microsoft.com/office/word/2010/wordprocessingDrawing" xmlns:wp="http://schemas.openxmlformats.org/drawingml/2006/wordprocessingDrawing" xmlns:w10="urn:schemas-microsoft-com:office:word" xmlns:w="http://schemas.openxmlformats.org/wordprocessingml/2006/main" xmlns:w14="http://schemas.microsoft.com/office/word/2010/wordml" xmlns:w15="http://schemas.microsoft.com/office/word/2012/wordml" xmlns:w16cei="http://schemas.microsoft.com/office/word/2026/wordml/cei" xmlns:w16cex="http://schemas.microsoft.com/office/word/2018/wordml/cex" xmlns:w16cid="http://schemas.microsoft.com/office/word/2016/wordml/cid" xmlns:w16="http://schemas.microsoft.com/office/word/2018/wordml" xmlns:w16du="http://schemas.microsoft.com/office/word/2023/wordml/word16du" xmlns:w16sdtdh="http://schemas.microsoft.com/office/word/2020/wordml/sdtdatahash" xmlns:w16sdtfl="http://schemas.microsoft.com/office/word/2024/wordml/sdtformatlock" xmlns:w16se="http://schemas.microsoft.com/office/word/2015/wordml/symex" xmlns:wpg="http://schemas.microsoft.com/office/word/2010/wordprocessingGroup" xmlns:wpi="http://schemas.microsoft.com/office/word/2010/wordprocessingInk" xmlns:wne="http://schemas.microsoft.com/office/word/2006/wordml" xmlns:wps="http://schemas.microsoft.com/office/word/2010/wordprocessingShape" mc:Ignorable="w14 w15 w16se w16cid w16 w16cex w16sdtdh w16sdtfl w16du wp14">
+<w:hdr xmlns:wpc="http://schemas.microsoft.com/office/word/2010/wordprocessingCanvas" xmlns:cx="http://schemas.microsoft.com/office/drawing/2014/chartex" xmlns:cx1="http://schemas.microsoft.com/office/drawing/2015/9/8/chartex" xmlns:cx2="http://schemas.microsoft.com/office/drawing/2015/10/21/chartex" xmlns:cx3="http://schemas.microsoft.com/office/drawing/2016/5/9/chartex" xmlns:cx4="http://schemas.microsoft.com/office/drawing/2016/5/10/chartex" xmlns:cx5="http://schemas.microsoft.com/office/drawing/2016/5/11/chartex" xmlns:cx6="http://schemas.microsoft.com/office/drawing/2016/5/12/chartex" xmlns:cx7="http://schemas.microsoft.com/office/drawing/2016/5/13/chartex" xmlns:cx8="http://schemas.microsoft.com/office/drawing/2016/5/14/chartex" xmlns:mc="http://schemas.openxmlformats.org/markup-compatibility/2006" xmlns:aink="http://schemas.microsoft.com/office/drawing/2016/ink" xmlns:am3d="http://schemas.microsoft.com/office/drawing/2017/model3d" xmlns:o="urn:schemas-microsoft-com:office:office" xmlns:oel="http://schemas.microsoft.com/office/2019/extlst" xmlns:r="http://schemas.openxmlformats.org/officeDocument/2006/relationships" xmlns:m="http://schemas.openxmlformats.org/officeDocument/2006/math" xmlns:v="urn:schemas-microsoft-com:vml" xmlns:wp14="http://schemas.microsoft.com/office/word/2010/wordprocessingDrawing" xmlns:wp="http://schemas.openxmlformats.org/drawingml/2006/wordprocessingDrawing" xmlns:w10="urn:schemas-microsoft-com:office:word" xmlns:w="http://schemas.openxmlformats.org/wordprocessingml/2006/main" xmlns:w14="http://schemas.microsoft.com/office/word/2010/wordml" xmlns:w15="http://schemas.microsoft.com/office/word/2012/wordml" xmlns:w16cex="http://schemas.microsoft.com/office/word/2018/wordml/cex" xmlns:w16cid="http://schemas.microsoft.com/office/word/2016/wordml/cid" xmlns:w16="http://schemas.microsoft.com/office/word/2018/wordml" xmlns:w16du="http://schemas.microsoft.com/office/word/2023/wordml/word16du" xmlns:w16sdtdh="http://schemas.microsoft.com/office/word/2020/wordml/sdtdatahash" xmlns:w16sdtfl="http://schemas.microsoft.com/office/word/2024/wordml/sdtformatlock" xmlns:w16se="http://schemas.microsoft.com/office/word/2015/wordml/symex" xmlns:wpg="http://schemas.microsoft.com/office/word/2010/wordprocessingGroup" xmlns:wpi="http://schemas.microsoft.com/office/word/2010/wordprocessingInk" xmlns:wne="http://schemas.microsoft.com/office/word/2006/wordml" xmlns:wps="http://schemas.microsoft.com/office/word/2010/wordprocessingShape" mc:Ignorable="w14 w15 w16se w16cid w16 w16cex w16sdtdh w16sdtfl w16du wp14">
   <w:p>
     <w:pPr>
       <w:pStyle w:val="Header"/>
@@ -1244,7 +1132,7 @@
 </file>
 
 <file path=word/header2.xml><?xml version="1.0" encoding="utf-8"?>
-<w:hdr xmlns:wpc="http://schemas.microsoft.com/office/word/2010/wordprocessingCanvas" xmlns:cx="http://schemas.microsoft.com/office/drawing/2014/chartex" xmlns:cx1="http://schemas.microsoft.com/office/drawing/2015/9/8/chartex" xmlns:cx2="http://schemas.microsoft.com/office/drawing/2015/10/21/chartex" xmlns:cx3="http://schemas.microsoft.com/office/drawing/2016/5/9/chartex" xmlns:cx4="http://schemas.microsoft.com/office/drawing/2016/5/10/chartex" xmlns:cx5="http://schemas.microsoft.com/office/drawing/2016/5/11/chartex" xmlns:cx6="http://schemas.microsoft.com/office/drawing/2016/5/12/chartex" xmlns:cx7="http://schemas.microsoft.com/office/drawing/2016/5/13/chartex" xmlns:cx8="http://schemas.microsoft.com/office/drawing/2016/5/14/chartex" xmlns:mc="http://schemas.openxmlformats.org/markup-compatibility/2006" xmlns:aink="http://schemas.microsoft.com/office/drawing/2016/ink" xmlns:am3d="http://schemas.microsoft.com/office/drawing/2017/model3d" xmlns:o="urn:schemas-microsoft-com:office:office" xmlns:oel="http://schemas.microsoft.com/office/2019/extlst" xmlns:r="http://schemas.openxmlformats.org/officeDocument/2006/relationships" xmlns:m="http://schemas.openxmlformats.org/officeDocument/2006/math" xmlns:v="urn:schemas-microsoft-com:vml" xmlns:wp14="http://schemas.microsoft.com/office/word/2010/wordprocessingDrawing" xmlns:wp="http://schemas.openxmlformats.org/drawingml/2006/wordprocessingDrawing" xmlns:w10="urn:schemas-microsoft-com:office:word" xmlns:w="http://schemas.openxmlformats.org/wordprocessingml/2006/main" xmlns:w14="http://schemas.microsoft.com/office/word/2010/wordml" xmlns:w15="http://schemas.microsoft.com/office/word/2012/wordml" xmlns:w16cei="http://schemas.microsoft.com/office/word/2026/wordml/cei" xmlns:w16cex="http://schemas.microsoft.com/office/word/2018/wordml/cex" xmlns:w16cid="http://schemas.microsoft.com/office/word/2016/wordml/cid" xmlns:w16="http://schemas.microsoft.com/office/word/2018/wordml" xmlns:w16du="http://schemas.microsoft.com/office/word/2023/wordml/word16du" xmlns:w16sdtdh="http://schemas.microsoft.com/office/word/2020/wordml/sdtdatahash" xmlns:w16sdtfl="http://schemas.microsoft.com/office/word/2024/wordml/sdtformatlock" xmlns:w16se="http://schemas.microsoft.com/office/word/2015/wordml/symex" xmlns:wpg="http://schemas.microsoft.com/office/word/2010/wordprocessingGroup" xmlns:wpi="http://schemas.microsoft.com/office/word/2010/wordprocessingInk" xmlns:wne="http://schemas.microsoft.com/office/word/2006/wordml" xmlns:wps="http://schemas.microsoft.com/office/word/2010/wordprocessingShape" mc:Ignorable="w14 w15 w16se w16cid w16 w16cex w16sdtdh w16sdtfl w16du wp14">
+<w:hdr xmlns:wpc="http://schemas.microsoft.com/office/word/2010/wordprocessingCanvas" xmlns:cx="http://schemas.microsoft.com/office/drawing/2014/chartex" xmlns:cx1="http://schemas.microsoft.com/office/drawing/2015/9/8/chartex" xmlns:cx2="http://schemas.microsoft.com/office/drawing/2015/10/21/chartex" xmlns:cx3="http://schemas.microsoft.com/office/drawing/2016/5/9/chartex" xmlns:cx4="http://schemas.microsoft.com/office/drawing/2016/5/10/chartex" xmlns:cx5="http://schemas.microsoft.com/office/drawing/2016/5/11/chartex" xmlns:cx6="http://schemas.microsoft.com/office/drawing/2016/5/12/chartex" xmlns:cx7="http://schemas.microsoft.com/office/drawing/2016/5/13/chartex" xmlns:cx8="http://schemas.microsoft.com/office/drawing/2016/5/14/chartex" xmlns:mc="http://schemas.openxmlformats.org/markup-compatibility/2006" xmlns:aink="http://schemas.microsoft.com/office/drawing/2016/ink" xmlns:am3d="http://schemas.microsoft.com/office/drawing/2017/model3d" xmlns:o="urn:schemas-microsoft-com:office:office" xmlns:oel="http://schemas.microsoft.com/office/2019/extlst" xmlns:r="http://schemas.openxmlformats.org/officeDocument/2006/relationships" xmlns:m="http://schemas.openxmlformats.org/officeDocument/2006/math" xmlns:v="urn:schemas-microsoft-com:vml" xmlns:wp14="http://schemas.microsoft.com/office/word/2010/wordprocessingDrawing" xmlns:wp="http://schemas.openxmlformats.org/drawingml/2006/wordprocessingDrawing" xmlns:w10="urn:schemas-microsoft-com:office:word" xmlns:w="http://schemas.openxmlformats.org/wordprocessingml/2006/main" xmlns:w14="http://schemas.microsoft.com/office/word/2010/wordml" xmlns:w15="http://schemas.microsoft.com/office/word/2012/wordml" xmlns:w16cex="http://schemas.microsoft.com/office/word/2018/wordml/cex" xmlns:w16cid="http://schemas.microsoft.com/office/word/2016/wordml/cid" xmlns:w16="http://schemas.microsoft.com/office/word/2018/wordml" xmlns:w16du="http://schemas.microsoft.com/office/word/2023/wordml/word16du" xmlns:w16sdtdh="http://schemas.microsoft.com/office/word/2020/wordml/sdtdatahash" xmlns:w16sdtfl="http://schemas.microsoft.com/office/word/2024/wordml/sdtformatlock" xmlns:w16se="http://schemas.microsoft.com/office/word/2015/wordml/symex" xmlns:wpg="http://schemas.microsoft.com/office/word/2010/wordprocessingGroup" xmlns:wpi="http://schemas.microsoft.com/office/word/2010/wordprocessingInk" xmlns:wne="http://schemas.microsoft.com/office/word/2006/wordml" xmlns:wps="http://schemas.microsoft.com/office/word/2010/wordprocessingShape" mc:Ignorable="w14 w15 w16se w16cid w16 w16cex w16sdtdh w16sdtfl w16du wp14">
   <w:p>
     <w:pPr>
       <w:pStyle w:val="Header"/>
@@ -1385,7 +1273,7 @@
             </wp:anchor>
           </w:drawing>
         </mc:Choice>
-        <mc:Fallback>
+        <mc:Fallback xmlns:w16cei="http://schemas.microsoft.com/office/word/2026/wordml/cei">
           <w:pict>
             <v:shapetype w14:anchorId="6DE74C12" id="_x0000_t202" coordsize="21600,21600" o:spt="202" path="m,l,21600r21600,l21600,xe">
               <v:stroke joinstyle="miter"/>
@@ -1592,7 +1480,7 @@
 </file>
 
 <file path=word/numbering.xml><?xml version="1.0" encoding="utf-8"?>
-<w:numbering xmlns:wpc="http://schemas.microsoft.com/office/word/2010/wordprocessingCanvas" xmlns:cx="http://schemas.microsoft.com/office/drawing/2014/chartex" xmlns:cx1="http://schemas.microsoft.com/office/drawing/2015/9/8/chartex" xmlns:cx2="http://schemas.microsoft.com/office/drawing/2015/10/21/chartex" xmlns:cx3="http://schemas.microsoft.com/office/drawing/2016/5/9/chartex" xmlns:cx4="http://schemas.microsoft.com/office/drawing/2016/5/10/chartex" xmlns:cx5="http://schemas.microsoft.com/office/drawing/2016/5/11/chartex" xmlns:cx6="http://schemas.microsoft.com/office/drawing/2016/5/12/chartex" xmlns:cx7="http://schemas.microsoft.com/office/drawing/2016/5/13/chartex" xmlns:cx8="http://schemas.microsoft.com/office/drawing/2016/5/14/chartex" xmlns:mc="http://schemas.openxmlformats.org/markup-compatibility/2006" xmlns:aink="http://schemas.microsoft.com/office/drawing/2016/ink" xmlns:am3d="http://schemas.microsoft.com/office/drawing/2017/model3d" xmlns:o="urn:schemas-microsoft-com:office:office" xmlns:oel="http://schemas.microsoft.com/office/2019/extlst" xmlns:r="http://schemas.openxmlformats.org/officeDocument/2006/relationships" xmlns:m="http://schemas.openxmlformats.org/officeDocument/2006/math" xmlns:v="urn:schemas-microsoft-com:vml" xmlns:wp14="http://schemas.microsoft.com/office/word/2010/wordprocessingDrawing" xmlns:wp="http://schemas.openxmlformats.org/drawingml/2006/wordprocessingDrawing" xmlns:w10="urn:schemas-microsoft-com:office:word" xmlns:w="http://schemas.openxmlformats.org/wordprocessingml/2006/main" xmlns:w14="http://schemas.microsoft.com/office/word/2010/wordml" xmlns:w15="http://schemas.microsoft.com/office/word/2012/wordml" xmlns:w16cei="http://schemas.microsoft.com/office/word/2026/wordml/cei" xmlns:w16cex="http://schemas.microsoft.com/office/word/2018/wordml/cex" xmlns:w16cid="http://schemas.microsoft.com/office/word/2016/wordml/cid" xmlns:w16="http://schemas.microsoft.com/office/word/2018/wordml" xmlns:w16du="http://schemas.microsoft.com/office/word/2023/wordml/word16du" xmlns:w16sdtdh="http://schemas.microsoft.com/office/word/2020/wordml/sdtdatahash" xmlns:w16sdtfl="http://schemas.microsoft.com/office/word/2024/wordml/sdtformatlock" xmlns:w16se="http://schemas.microsoft.com/office/word/2015/wordml/symex" xmlns:wpg="http://schemas.microsoft.com/office/word/2010/wordprocessingGroup" xmlns:wpi="http://schemas.microsoft.com/office/word/2010/wordprocessingInk" xmlns:wne="http://schemas.microsoft.com/office/word/2006/wordml" xmlns:wps="http://schemas.microsoft.com/office/word/2010/wordprocessingShape" mc:Ignorable="w14 w15 w16se w16cid w16 w16cex w16sdtdh w16sdtfl w16du wp14">
+<w:numbering xmlns:wpc="http://schemas.microsoft.com/office/word/2010/wordprocessingCanvas" xmlns:cx="http://schemas.microsoft.com/office/drawing/2014/chartex" xmlns:cx1="http://schemas.microsoft.com/office/drawing/2015/9/8/chartex" xmlns:cx2="http://schemas.microsoft.com/office/drawing/2015/10/21/chartex" xmlns:cx3="http://schemas.microsoft.com/office/drawing/2016/5/9/chartex" xmlns:cx4="http://schemas.microsoft.com/office/drawing/2016/5/10/chartex" xmlns:cx5="http://schemas.microsoft.com/office/drawing/2016/5/11/chartex" xmlns:cx6="http://schemas.microsoft.com/office/drawing/2016/5/12/chartex" xmlns:cx7="http://schemas.microsoft.com/office/drawing/2016/5/13/chartex" xmlns:cx8="http://schemas.microsoft.com/office/drawing/2016/5/14/chartex" xmlns:mc="http://schemas.openxmlformats.org/markup-compatibility/2006" xmlns:aink="http://schemas.microsoft.com/office/drawing/2016/ink" xmlns:am3d="http://schemas.microsoft.com/office/drawing/2017/model3d" xmlns:o="urn:schemas-microsoft-com:office:office" xmlns:oel="http://schemas.microsoft.com/office/2019/extlst" xmlns:r="http://schemas.openxmlformats.org/officeDocument/2006/relationships" xmlns:m="http://schemas.openxmlformats.org/officeDocument/2006/math" xmlns:v="urn:schemas-microsoft-com:vml" xmlns:wp14="http://schemas.microsoft.com/office/word/2010/wordprocessingDrawing" xmlns:wp="http://schemas.openxmlformats.org/drawingml/2006/wordprocessingDrawing" xmlns:w10="urn:schemas-microsoft-com:office:word" xmlns:w="http://schemas.openxmlformats.org/wordprocessingml/2006/main" xmlns:w14="http://schemas.microsoft.com/office/word/2010/wordml" xmlns:w15="http://schemas.microsoft.com/office/word/2012/wordml" xmlns:w16cex="http://schemas.microsoft.com/office/word/2018/wordml/cex" xmlns:w16cid="http://schemas.microsoft.com/office/word/2016/wordml/cid" xmlns:w16="http://schemas.microsoft.com/office/word/2018/wordml" xmlns:w16du="http://schemas.microsoft.com/office/word/2023/wordml/word16du" xmlns:w16sdtdh="http://schemas.microsoft.com/office/word/2020/wordml/sdtdatahash" xmlns:w16sdtfl="http://schemas.microsoft.com/office/word/2024/wordml/sdtformatlock" xmlns:w16se="http://schemas.microsoft.com/office/word/2015/wordml/symex" xmlns:wpg="http://schemas.microsoft.com/office/word/2010/wordprocessingGroup" xmlns:wpi="http://schemas.microsoft.com/office/word/2010/wordprocessingInk" xmlns:wne="http://schemas.microsoft.com/office/word/2006/wordml" xmlns:wps="http://schemas.microsoft.com/office/word/2010/wordprocessingShape" mc:Ignorable="w14 w15 w16se w16cid w16 w16cex w16sdtdh w16sdtfl w16du wp14">
   <w:abstractNum w:abstractNumId="0" w15:restartNumberingAfterBreak="0">
     <w:nsid w:val="061B5C9E"/>
     <w:multiLevelType w:val="hybridMultilevel"/>
@@ -3613,12 +3501,7 @@
 </file>
 
 <file path=customXml/item1.xml><?xml version="1.0" encoding="utf-8"?>
-<?mso-contentType ?>
-<FormTemplates xmlns="http://schemas.microsoft.com/sharepoint/v3/contenttype/forms">
-  <Display>DocumentLibraryForm</Display>
-  <Edit>DocumentLibraryForm</Edit>
-  <New>DocumentLibraryForm</New>
-</FormTemplates>
+<b:Sources xmlns:b="http://schemas.openxmlformats.org/officeDocument/2006/bibliography" xmlns="http://schemas.openxmlformats.org/officeDocument/2006/bibliography" SelectedStyle="\APA.XSL" StyleName="APA"/>
 </file>
 
 <file path=customXml/item2.xml><?xml version="1.0" encoding="utf-8"?>
@@ -3635,7 +3518,12 @@
 </file>
 
 <file path=customXml/item3.xml><?xml version="1.0" encoding="utf-8"?>
-<b:Sources xmlns:b="http://schemas.openxmlformats.org/officeDocument/2006/bibliography" xmlns="http://schemas.openxmlformats.org/officeDocument/2006/bibliography" SelectedStyle="\APA.XSL" StyleName="APA"/>
+<?mso-contentType ?>
+<FormTemplates xmlns="http://schemas.microsoft.com/sharepoint/v3/contenttype/forms">
+  <Display>DocumentLibraryForm</Display>
+  <Edit>DocumentLibraryForm</Edit>
+  <New>DocumentLibraryForm</New>
+</FormTemplates>
 </file>
 
 <file path=customXml/item4.xml><?xml version="1.0" encoding="utf-8"?>
@@ -3885,9 +3773,9 @@
 </file>
 
 <file path=customXml/itemProps1.xml><?xml version="1.0" encoding="utf-8"?>
-<ds:datastoreItem xmlns:ds="http://schemas.openxmlformats.org/officeDocument/2006/customXml" ds:itemID="{2ACA00A0-0EB9-4F25-B1A0-9480A1DEA0B5}">
+<ds:datastoreItem xmlns:ds="http://schemas.openxmlformats.org/officeDocument/2006/customXml" ds:itemID="{4202E056-596C-4D43-866F-DBCC294656E0}">
   <ds:schemaRefs>
-    <ds:schemaRef ds:uri="http://schemas.microsoft.com/sharepoint/v3/contenttype/forms"/>
+    <ds:schemaRef ds:uri="http://schemas.openxmlformats.org/officeDocument/2006/bibliography"/>
   </ds:schemaRefs>
 </ds:datastoreItem>
 </file>
@@ -3905,9 +3793,9 @@
 </file>
 
 <file path=customXml/itemProps3.xml><?xml version="1.0" encoding="utf-8"?>
-<ds:datastoreItem xmlns:ds="http://schemas.openxmlformats.org/officeDocument/2006/customXml" ds:itemID="{4202E056-596C-4D43-866F-DBCC294656E0}">
+<ds:datastoreItem xmlns:ds="http://schemas.openxmlformats.org/officeDocument/2006/customXml" ds:itemID="{2ACA00A0-0EB9-4F25-B1A0-9480A1DEA0B5}">
   <ds:schemaRefs>
-    <ds:schemaRef ds:uri="http://schemas.openxmlformats.org/officeDocument/2006/bibliography"/>
+    <ds:schemaRef ds:uri="http://schemas.microsoft.com/sharepoint/v3/contenttype/forms"/>
   </ds:schemaRefs>
 </ds:datastoreItem>
 </file>

</xml_diff>